<commit_message>
Restore 42-day collection window and finalise invitation email
Collection closes Monday 5 October, withdrawal Monday 19 October, from a 24 August start. Returns to the window section 5.4 specifies, so no deviation is needed and checkpoints stay at days 14, 21 and 28.

v2.1 becomes the single live invitation as project_owner_invitation_email.docx, with corrected dates, UKSA's register title, the measured 5-10 minute duration, a reminder trigger rather than a deadline, and the whether-or-two typo fixed. Superseded drafts retained and marked in the manifest.

Participant information v3.2 still outstanding: the approved document says 2 October while the dictionary now says 19 October.
</commit_message>
<xml_diff>
--- a/preregistration/package/06_redcap/participant_materials/project_owner_invitation_email_v2.docx
+++ b/preregistration/package/06_redcap/participant_materials/project_owner_invitation_email_v2.docx
@@ -259,7 +259,7 @@
           <w:highlight w:val="yellow"/>
           <w:rtl w:val="0"/>
         </w:rPr>
-        <w:t xml:space="preserve">Contact details are stored separately from review responses. We will not name you or attribute quotations to you without permission, although complete anonymity cannot be guaranteed because responses concern publicly identifiable projects. You can withdraw any submitted review by emailing me up to Friday 2 October 2026</w:t>
+        <w:t xml:space="preserve">Contact details are stored separately from review responses. We will not name you or attribute quotations to you without permission, although complete anonymity cannot be guaranteed because responses concern publicly identifiable projects. You can withdraw any submitted review by emailing me up to Monday 19 October 2026</w:t>
       </w:r>
       <w:r>
         <w:rPr>
@@ -291,7 +291,7 @@
         <w:rPr>
           <w:rtl w:val="0"/>
         </w:rPr>
-        <w:t xml:space="preserve">, although the review remains open until Friday 18 September 2026.</w:t>
+        <w:t xml:space="preserve">, although the review remains open until Monday 5 October 2026.</w:t>
       </w:r>
     </w:p>
     <w:p>

</xml_diff>